<commit_message>
Ajusta senioridade para Júnior→Pleno e reforça arquitetura/testes no CV
- Currículo PT/EN (docx + pdf): título "Desenvolvedor .NET Pleno" /
  "Mid-Level .NET Developer", resumo reescrito (6+ anos em TI, promoção
  Júnior→Pleno), bullet de SOLID/Clean Architecture/testes de unidade,
  "Liderança técnica" -> "Participação técnica" na migração CNPJ
- Eleva LayoutParser Suite a projeto principal (organização GitHub,
  .NET 10/4.8.1) no CV e nos cards do portfólio
- pt/en.html: meta tags, JSON-LD (jobTitle/seeks), h2, resumo e cargo
  da experiência alinhados a Pleno; cache-bust dos PDFs (v4)

Co-Authored-By: Claude Sonnet 5 <noreply@anthropic.com>
</commit_message>
<xml_diff>
--- a/assets/word/Elson-Lopes-CV-EN.docx
+++ b/assets/word/Elson-Lopes-CV-EN.docx
@@ -29,7 +29,7 @@
           <w:sz w:val="24"/>
           <w:szCs w:val="24"/>
         </w:rPr>
-        <w:t xml:space="preserve">Senior .NET Developer  |  C# / ASP.NET Core / SQL Server</w:t>
+        <w:t xml:space="preserve">Mid-Level .NET Developer  |  C# / ASP.NET Core / SQL Server</w:t>
       </w:r>
     </w:p>
     <w:p>
@@ -89,7 +89,7 @@
           <w:sz w:val="20"/>
           <w:szCs w:val="20"/>
         </w:rPr>
-        <w:t xml:space="preserve">Senior .NET Developer with 6+ years of experience across the full software development lifecycle in C#/.NET, building high-complexity, mission-critical enterprise systems. Strong background in ASP.NET Core, Web API, multi-database architecture (SQL Server, Oracle, Informix) and ORMs (NHibernate, Entity Framework Core). Specialist in electronic tax documents (NF-e, CT-e, NFS-e) and multi-state government (SEFAZ) integrations. Fullstack experience with React and TypeScript. Committed to clean code, SOLID principles, automated testing and scalable architecture.</w:t>
+        <w:t xml:space="preserve">Mid-level .NET Developer with 6+ years in IT — the most recent years focused on C#/.NET development (promoted from Junior to Mid-level) and the earlier years on analysis of complex fiscal systems. Full-lifecycle work on mission-critical enterprise systems: REST APIs with ASP.NET Core and Web API, multi-database architecture (SQL Server, Oracle, Informix) with Entity Framework Core and NHibernate, applying SOLID and Clean Architecture with unit testing. Specialist in electronic tax documents (NF-e, CT-e, NFS-e) and multi-state government (SEFAZ) integrations. Fullstack experience with React and TypeScript. Open to Mid-level .NET Developer roles (remote or Lages/SC, Brazil).</w:t>
       </w:r>
     </w:p>
     <w:p>
@@ -236,7 +236,7 @@
           <w:sz w:val="21"/>
           <w:szCs w:val="21"/>
         </w:rPr>
-        <w:t xml:space="preserve">Software Developer (.NET) — NDD Tech</w:t>
+        <w:t xml:space="preserve">Software Developer .NET (Junior to Mid-level) — NDD Tech</w:t>
       </w:r>
       <w:r>
         <w:rPr>
@@ -299,7 +299,25 @@
           <w:sz w:val="20"/>
           <w:szCs w:val="20"/>
         </w:rPr>
-        <w:t xml:space="preserve">Technical lead for the Alphanumeric CNPJ migration across high-volume tables, including decomposition and recomposition of the fiscal access key.</w:t>
+        <w:t xml:space="preserve">Applied SOLID and Clean Architecture principles, with NUnit/Moq unit tests and peer code review.</w:t>
+      </w:r>
+    </w:p>
+    <w:p>
+      <w:pPr>
+        <w:pStyle w:val="ListParagraph"/>
+        <w:numPr>
+          <w:ilvl w:val="0"/>
+          <w:numId w:val="2"/>
+        </w:numPr>
+        <w:spacing w:after="40"/>
+      </w:pPr>
+      <w:r>
+        <w:rPr>
+          <w:rFonts w:ascii="Calibri" w:cs="Calibri" w:eastAsia="Calibri" w:hAnsi="Calibri"/>
+          <w:sz w:val="20"/>
+          <w:szCs w:val="20"/>
+        </w:rPr>
+        <w:t xml:space="preserve">Contributed to the Alphanumeric CNPJ migration across high-volume tables, including decomposition and recomposition of the fiscal access key.</w:t>
       </w:r>
     </w:p>
     <w:p>
@@ -434,25 +452,25 @@
           <w:sz w:val="20"/>
           <w:szCs w:val="20"/>
         </w:rPr>
-        <w:t xml:space="preserve">Automated configuration-file analysis with Python, cutting diagnosis time.</w:t>
-      </w:r>
-    </w:p>
-    <w:p>
-      <w:pPr>
-        <w:pStyle w:val="ListParagraph"/>
-        <w:numPr>
-          <w:ilvl w:val="0"/>
-          <w:numId w:val="2"/>
-        </w:numPr>
-        <w:spacing w:after="40"/>
-      </w:pPr>
-      <w:r>
-        <w:rPr>
-          <w:rFonts w:ascii="Calibri" w:cs="Calibri" w:eastAsia="Calibri" w:hAnsi="Calibri"/>
-          <w:sz w:val="20"/>
-          <w:szCs w:val="20"/>
-        </w:rPr>
-        <w:t xml:space="preserve">Bridged support and engineering teams, progressing into a C#/.NET development role.</w:t>
+        <w:t xml:space="preserve">Automated configuration-file analysis with Python, speeding up incident diagnosis.</w:t>
+      </w:r>
+    </w:p>
+    <w:p>
+      <w:pPr>
+        <w:pStyle w:val="ListParagraph"/>
+        <w:numPr>
+          <w:ilvl w:val="0"/>
+          <w:numId w:val="2"/>
+        </w:numPr>
+        <w:spacing w:after="40"/>
+      </w:pPr>
+      <w:r>
+        <w:rPr>
+          <w:rFonts w:ascii="Calibri" w:cs="Calibri" w:eastAsia="Calibri" w:hAnsi="Calibri"/>
+          <w:sz w:val="20"/>
+          <w:szCs w:val="20"/>
+        </w:rPr>
+        <w:t xml:space="preserve">Bridged support and engineering teams, transitioning into a C#/.NET development role.</w:t>
       </w:r>
     </w:p>
     <w:p>
@@ -580,6 +598,24 @@
           <w:szCs w:val="24"/>
         </w:rPr>
         <w:t xml:space="preserve">SELECTED PROJECTS</w:t>
+      </w:r>
+    </w:p>
+    <w:p>
+      <w:pPr>
+        <w:pStyle w:val="ListParagraph"/>
+        <w:numPr>
+          <w:ilvl w:val="0"/>
+          <w:numId w:val="2"/>
+        </w:numPr>
+        <w:spacing w:after="40"/>
+      </w:pPr>
+      <w:r>
+        <w:rPr>
+          <w:rFonts w:ascii="Calibri" w:cs="Calibri" w:eastAsia="Calibri" w:hAnsi="Calibri"/>
+          <w:sz w:val="20"/>
+          <w:szCs w:val="20"/>
+        </w:rPr>
+        <w:t xml:space="preserve">LayoutParser Suite (main project, github.com/Elsonc1) — GitHub organization with multiple repositories in .NET 10 and .NET 4.8.1 for parsing fiscal layouts: REST API, reusable parsing library and a decryption utility. Layered architecture, Serilog logging and Swagger/OpenAPI docs.</w:t>
       </w:r>
     </w:p>
     <w:p>

</xml_diff>

<commit_message>
Corrige claim de IA multi-provedor no LayoutParser (Gemini/OpenAI saíram)
O README do LayoutParserApi ainda lista badges "Ollama | Gemini | OpenAI",
mas o rascunho de perfil da organização (mais recente) confirma que
Gemini/OpenAI foram decomissionados como provedores de LLM — hoje é
Ollama local only (RAG + few-shot), justamente por dado fiscal sensível
não poder sair para a nuvem sem autorização explícita.

Troca "IA multi-provedor (Ollama, Gemini, OpenAI)" por "IA local (Ollama,
RAG + few-shot)" no CV (PT/EN) e no portfólio, incluindo tech-tags e
JSON-LD knowsAbout. Cache-bust dos PDFs (v6).

Co-Authored-By: Claude Sonnet 5 <noreply@anthropic.com>
</commit_message>
<xml_diff>
--- a/assets/word/Elson-Lopes-CV-EN.docx
+++ b/assets/word/Elson-Lopes-CV-EN.docx
@@ -89,7 +89,7 @@
           <w:sz w:val="20"/>
           <w:szCs w:val="20"/>
         </w:rPr>
-        <w:t xml:space="preserve">Mid-level .NET Developer with 6+ years in IT — the most recent years focused on C#/.NET development (promoted from Junior to Mid-level) and the earlier years on analysis of complex fiscal systems. Full-lifecycle work on mission-critical enterprise systems: REST APIs with ASP.NET Core and Web API, multi-database architecture (SQL Server, Oracle, Informix) with Entity Framework Core and NHibernate, applying SOLID and Clean Architecture with unit testing. Specialist in electronic tax documents (NF-e, CT-e, NFS-e) and multi-state government (SEFAZ) integrations. Maintainer of LayoutParser, a self-driven ecosystem in production with a .NET 10 API, multi-provider AI and E2E testing, currently being evaluated for commercialization. Fullstack experience with React and TypeScript. Open to Mid-level .NET Developer roles (remote or Lages/SC, Brazil).</w:t>
+        <w:t xml:space="preserve">Mid-level .NET Developer with 6+ years in IT — the most recent years focused on C#/.NET development (promoted from Junior to Mid-level) and the earlier years on analysis of complex fiscal systems. Full-lifecycle work on mission-critical enterprise systems: REST APIs with ASP.NET Core and Web API, multi-database architecture (SQL Server, Oracle, Informix) with Entity Framework Core and NHibernate, applying SOLID and Clean Architecture with unit testing. Specialist in electronic tax documents (NF-e, CT-e, NFS-e) and multi-state government (SEFAZ) integrations. Maintainer of LayoutParser, a self-driven ecosystem in production with a .NET 10 API, local AI (Ollama, RAG) and E2E testing, currently being evaluated for commercialization. Fullstack experience with React and TypeScript. Open to Mid-level .NET Developer roles (remote or Lages/SC, Brazil).</w:t>
       </w:r>
     </w:p>
     <w:p>
@@ -199,7 +199,7 @@
           <w:sz w:val="20"/>
           <w:szCs w:val="20"/>
         </w:rPr>
-        <w:t xml:space="preserve">Applied AI: LLM integration (Ollama, Gemini, OpenAI), RAG, automated XSLT/TCL generation, GitHub Copilot, MCP Server for architectural pattern validation</w:t>
+        <w:t xml:space="preserve">Applied AI: RAG + few-shot with local Ollama (on-premise fiscal data), automated XSLT/TCL generation, GitHub Copilot, MCP Server for architectural pattern validation</w:t>
       </w:r>
     </w:p>
     <w:p>
@@ -615,7 +615,7 @@
           <w:sz w:val="20"/>
           <w:szCs w:val="20"/>
         </w:rPr>
-        <w:t xml:space="preserve">LayoutParser — self-driven side project, in production (github.com/LayoutParser · layoutparser.duckdns.org). Ecosystem of 6+ repositories: .NET 10 API with 20+ controllers, Redis cache, SQL Server and Serilog/Elastic observability; multi-provider AI layer (Ollama, Gemini, OpenAI) that learns to generate XSLT/TCL transformations from XML layouts; React/Vite frontend with a Node/Fastify gateway; Cypress E2E suite validating real fiscal acceptance against a simulated SEFAZ environment. Actively deployed; being evaluated for commercialization as a product/service.</w:t>
+        <w:t xml:space="preserve">LayoutParser — self-driven side project, in production (github.com/LayoutParser · layoutparser.duckdns.org). Ecosystem of 6+ repositories: .NET 10 API with 20+ controllers, Redis cache, SQL Server and Serilog/Elastic observability; local AI layer (Ollama, RAG + few-shot) that learns to generate XSLT/TCL transformations from XML layouts; React/Vite frontend with a Node/Fastify gateway; Cypress E2E suite validating real fiscal acceptance against a simulated SEFAZ environment. Actively deployed; being evaluated for commercialization as a product/service.</w:t>
       </w:r>
     </w:p>
     <w:p>

</xml_diff>